<commit_message>
new style for all pages and added index html code  and css.
</commit_message>
<xml_diff>
--- a/week03/Family Float - White Rafting Project/Rafting_Site_Planning_Document.docx
+++ b/week03/Family Float - White Rafting Project/Rafting_Site_Planning_Document.docx
@@ -55,11 +55,16 @@
         <w:t>, increasing safety and accessibility to a younger audience</w:t>
       </w:r>
       <w:r>
-        <w:t>. Targeting families with children between the ages of 8-18, as well as adults aged 18-50. This would be an excellent option for beginner white water rafters, or hesitant thrill seekers. Our river courses are ideal for family reunions, small and large</w:t>
+        <w:t xml:space="preserve">. Targeting families with children between the ages of 8-18, as well as adults aged 18-50. This would be an excellent option for beginner white water rafters, or hesitant thrill seekers. Our river courses are ideal for family reunions, small and </w:t>
+      </w:r>
+      <w:proofErr w:type="gramStart"/>
+      <w:r>
+        <w:t>large</w:t>
       </w:r>
       <w:r>
         <w:t xml:space="preserve"> friend</w:t>
       </w:r>
+      <w:proofErr w:type="gramEnd"/>
       <w:r>
         <w:t xml:space="preserve"> groups, </w:t>
       </w:r>
@@ -190,32 +195,80 @@
     </w:p>
     <w:p>
       <w:r>
-        <w:t xml:space="preserve"> - Primary Color: #429AD2</w:t>
+        <w:t xml:space="preserve"> - Primary </w:t>
+      </w:r>
+      <w:proofErr w:type="gramStart"/>
+      <w:r>
+        <w:t>Color: #</w:t>
+      </w:r>
+      <w:proofErr w:type="gramEnd"/>
+      <w:r>
+        <w:t>429AD2</w:t>
       </w:r>
     </w:p>
     <w:p>
       <w:r>
-        <w:t xml:space="preserve"> - Secondary Color: #073F6F</w:t>
+        <w:t xml:space="preserve"> - Secondary </w:t>
+      </w:r>
+      <w:proofErr w:type="gramStart"/>
+      <w:r>
+        <w:t>Color: #</w:t>
+      </w:r>
+      <w:proofErr w:type="gramEnd"/>
+      <w:r>
+        <w:t>073F6F</w:t>
       </w:r>
     </w:p>
     <w:p>
       <w:r>
-        <w:t xml:space="preserve"> - Accent 1 Color: #EFF9FF</w:t>
+        <w:t xml:space="preserve"> - Accent 1 </w:t>
+      </w:r>
+      <w:proofErr w:type="gramStart"/>
+      <w:r>
+        <w:t>Color: #</w:t>
+      </w:r>
+      <w:proofErr w:type="gramEnd"/>
+      <w:r>
+        <w:t>EFF9FF</w:t>
       </w:r>
     </w:p>
     <w:p>
       <w:r>
-        <w:t xml:space="preserve"> - Accent 2 Color: #676F54</w:t>
+        <w:t xml:space="preserve"> - Accent 2 </w:t>
+      </w:r>
+      <w:proofErr w:type="gramStart"/>
+      <w:r>
+        <w:t>Color: #</w:t>
+      </w:r>
+      <w:proofErr w:type="gramEnd"/>
+      <w:r>
+        <w:t>676F54</w:t>
       </w:r>
     </w:p>
     <w:p>
       <w:r>
-        <w:t>- Accent 3 Color: #7D5505</w:t>
+        <w:t xml:space="preserve">- Accent 3 </w:t>
+      </w:r>
+      <w:proofErr w:type="gramStart"/>
+      <w:r>
+        <w:t>Color: #</w:t>
+      </w:r>
+      <w:proofErr w:type="gramEnd"/>
+      <w:r>
+        <w:t>7D5505</w:t>
       </w:r>
     </w:p>
     <w:p>
       <w:r>
-        <w:t>Palette generated using Coolors:</w:t>
+        <w:t xml:space="preserve">Palette generated using </w:t>
+      </w:r>
+      <w:proofErr w:type="spellStart"/>
+      <w:r>
+        <w:t>Coolors</w:t>
+      </w:r>
+      <w:proofErr w:type="spellEnd"/>
+      <w:r>
+        <w:t>:</w:t>
       </w:r>
     </w:p>
     <w:p>
@@ -260,6 +313,73 @@
     </w:p>
     <w:p/>
     <w:p/>
+    <w:p>
+      <w:r>
+        <w:t>NEW BACKGROUND</w:t>
+      </w:r>
+    </w:p>
+    <w:p>
+      <w:pPr>
+        <w:rPr>
+          <w:b/>
+          <w:bCs/>
+        </w:rPr>
+      </w:pPr>
+      <w:r>
+        <w:t xml:space="preserve">Use </w:t>
+      </w:r>
+      <w:r>
+        <w:rPr>
+          <w:b/>
+          <w:bCs/>
+        </w:rPr>
+        <w:t xml:space="preserve">Alice </w:t>
+      </w:r>
+      <w:proofErr w:type="gramStart"/>
+      <w:r>
+        <w:rPr>
+          <w:b/>
+          <w:bCs/>
+        </w:rPr>
+        <w:t>Blue (#</w:t>
+      </w:r>
+      <w:proofErr w:type="gramEnd"/>
+      <w:r>
+        <w:rPr>
+          <w:b/>
+          <w:bCs/>
+        </w:rPr>
+        <w:t>EFF9FF)</w:t>
+      </w:r>
+    </w:p>
+    <w:p>
+      <w:pPr>
+        <w:rPr>
+          <w:b/>
+          <w:bCs/>
+        </w:rPr>
+      </w:pPr>
+    </w:p>
+    <w:p>
+      <w:pPr>
+        <w:rPr>
+          <w:b/>
+          <w:bCs/>
+        </w:rPr>
+      </w:pPr>
+      <w:r>
+        <w:rPr>
+          <w:b/>
+          <w:bCs/>
+        </w:rPr>
+        <w:t>TEXT COLOR</w:t>
+      </w:r>
+    </w:p>
+    <w:p>
+      <w:r>
+        <w:t>#7D5505 (Field Drab)</w:t>
+      </w:r>
+    </w:p>
     <w:sectPr>
       <w:pgSz w:w="12240" w:h="15840"/>
       <w:pgMar w:top="1440" w:right="1800" w:bottom="1440" w:left="1800" w:header="720" w:footer="720" w:gutter="0"/>

</xml_diff>